<commit_message>
feat: time tracking, material quote batch import, estimates/jobs
Time tracking: simplified entry UI; ST/OT persistence and snap fixes; readonly pivot. Apply sql/027_time_entries_time_type.sql for time_type on time entries.

Vendor material quote import: multi-file batch upload/analyze, combined results table, import actions, duplicate handling (material_quote_import.py).

Also: estimate editor/persistence/proposal_exports/job_scope/defaults; proposal.py; assets pages; job database + detail view; time_grid_service; estimate Word template + patch_proposal_template.py script.
Co-authored-by: Cursor <cursoragent@cursor.com>
</commit_message>
<xml_diff>
--- a/assets/estimate_template_autofill_logo_updated.docx
+++ b/assets/estimate_template_autofill_logo_updated.docx
@@ -433,6 +433,11 @@
           <w14:ligatures w14:val="none"/>
         </w:rPr>
         <w:t>{{CUSTOMER_NAME}} Responsibilities</w:t>
+      </w:r>
+    </w:p>
+    <w:p>
+      <w:r>
+        <w:t xml:space="preserve">{{CUSTOMER_RESPONSIBILITIES}}</w:t>
       </w:r>
     </w:p>
     <w:p>

</xml_diff>

<commit_message>
Proposal: shared layout + HTML preview, header CSS (white on blue)
- Remove Customer Location from proposal flow and exports

- DOCX template patch (estimate_template_autofill_logo_updated)

- Refine proposal_exports, proposal.py, estimate editor; add proposal_document_layout

Co-authored-by: Cursor <cursoragent@cursor.com>
</commit_message>
<xml_diff>
--- a/assets/estimate_template_autofill_logo_updated.docx
+++ b/assets/estimate_template_autofill_logo_updated.docx
@@ -155,46 +155,6 @@
           <w:bCs/>
         </w:rPr>
         <w:t xml:space="preserve">}}                    </w:t>
-      </w:r>
-    </w:p>
-    <w:p>
-      <w:pPr>
-        <w:pBdr>
-          <w:bottom w:val="thinThickThinMediumGap" w:sz="18" w:space="1" w:color="auto"/>
-        </w:pBdr>
-        <w:tabs>
-          <w:tab w:val="left" w:pos="6780"/>
-          <w:tab w:val="left" w:pos="8055"/>
-        </w:tabs>
-        <w:rPr>
-          <w:rFonts w:ascii="Arial" w:hAnsi="Arial" w:cs="Arial"/>
-          <w:b/>
-          <w:bCs/>
-        </w:rPr>
-      </w:pPr>
-      <w:r>
-        <w:rPr>
-          <w:rFonts w:ascii="Arial" w:hAnsi="Arial" w:cs="Arial"/>
-          <w:b/>
-          <w:bCs/>
-        </w:rPr>
-        <w:t>Customer Location: {{C</w:t>
-      </w:r>
-      <w:r>
-        <w:rPr>
-          <w:rFonts w:ascii="Arial" w:hAnsi="Arial" w:cs="Arial"/>
-          <w:b/>
-          <w:bCs/>
-        </w:rPr>
-        <w:t>USTOMER_LOCATION</w:t>
-      </w:r>
-      <w:r>
-        <w:rPr>
-          <w:rFonts w:ascii="Arial" w:hAnsi="Arial" w:cs="Arial"/>
-          <w:b/>
-          <w:bCs/>
-        </w:rPr>
-        <w:t>}}</w:t>
       </w:r>
     </w:p>
     <w:p>

</xml_diff>